<commit_message>
[reporting][subdoc]Updated templates, comment #639
</commit_message>
<xml_diff>
--- a/reporting/subdocs_templates/table_of_evolution_of_the_highest_risks_template.docx
+++ b/reporting/subdocs_templates/table_of_evolution_of_the_highest_risks_template.docx
@@ -48,12 +48,16 @@
               <w:rPr>
                 <w:b/>
                 <w:bCs/>
-              </w:rPr>
-            </w:pPr>
-            <w:r>
-              <w:rPr>
-                <w:b/>
-                <w:bCs/>
+                <w:sz w:val="20"/>
+                <w:szCs w:val="20"/>
+              </w:rPr>
+            </w:pPr>
+            <w:r>
+              <w:rPr>
+                <w:b/>
+                <w:bCs/>
+                <w:sz w:val="20"/>
+                <w:szCs w:val="20"/>
               </w:rPr>
               <w:t>{{ translations.id|upper }}</w:t>
             </w:r>
@@ -76,12 +80,16 @@
               <w:rPr>
                 <w:b/>
                 <w:bCs/>
-              </w:rPr>
-            </w:pPr>
-            <w:r>
-              <w:rPr>
-                <w:b/>
-                <w:bCs/>
+                <w:sz w:val="20"/>
+                <w:szCs w:val="20"/>
+              </w:rPr>
+            </w:pPr>
+            <w:r>
+              <w:rPr>
+                <w:b/>
+                <w:bCs/>
+                <w:sz w:val="20"/>
+                <w:szCs w:val="20"/>
               </w:rPr>
               <w:t>{{ translations.asset|upper }}</w:t>
             </w:r>
@@ -104,12 +112,16 @@
               <w:rPr>
                 <w:b/>
                 <w:bCs/>
-              </w:rPr>
-            </w:pPr>
-            <w:r>
-              <w:rPr>
-                <w:b/>
-                <w:bCs/>
+                <w:sz w:val="20"/>
+                <w:szCs w:val="20"/>
+              </w:rPr>
+            </w:pPr>
+            <w:r>
+              <w:rPr>
+                <w:b/>
+                <w:bCs/>
+                <w:sz w:val="20"/>
+                <w:szCs w:val="20"/>
               </w:rPr>
               <w:t>{{ translations.threat|upper }}</w:t>
             </w:r>
@@ -132,31 +144,34 @@
               <w:rPr>
                 <w:b/>
                 <w:bCs/>
-              </w:rPr>
-            </w:pPr>
-            <w:r>
-              <w:rPr>
-                <w:b/>
-                <w:bCs/>
+                <w:sz w:val="20"/>
+                <w:szCs w:val="20"/>
+              </w:rPr>
+            </w:pPr>
+            <w:r>
+              <w:rPr>
+                <w:b/>
+                <w:bCs/>
+                <w:sz w:val="20"/>
+                <w:szCs w:val="20"/>
               </w:rPr>
               <w:t>{{ translations.</w:t>
             </w:r>
             <w:r>
+              <w:rPr>
+                <w:sz w:val="20"/>
+                <w:szCs w:val="20"/>
+              </w:rPr>
               <w:t xml:space="preserve"> </w:t>
             </w:r>
             <w:r>
               <w:rPr>
                 <w:b/>
                 <w:bCs/>
-              </w:rPr>
-              <w:t>vulnerability</w:t>
-            </w:r>
-            <w:r>
-              <w:rPr>
-                <w:b/>
-                <w:bCs/>
-              </w:rPr>
-              <w:t>|upper }}</w:t>
+                <w:sz w:val="20"/>
+                <w:szCs w:val="20"/>
+              </w:rPr>
+              <w:t>vulnerability|upper }}</w:t>
             </w:r>
           </w:p>
         </w:tc>
@@ -176,6 +191,8 @@
               <w:rPr>
                 <w:b/>
                 <w:bCs/>
+                <w:sz w:val="20"/>
+                <w:szCs w:val="20"/>
                 <w:lang w:val="en-US"/>
               </w:rPr>
             </w:pPr>
@@ -184,6 +201,8 @@
               <w:rPr>
                 <w:b/>
                 <w:bCs/>
+                <w:sz w:val="20"/>
+                <w:szCs w:val="20"/>
                 <w:lang w:val="en-US"/>
               </w:rPr>
               <w:t>{{ translations</w:t>
@@ -193,12 +212,16 @@
               <w:rPr>
                 <w:b/>
                 <w:bCs/>
+                <w:sz w:val="20"/>
+                <w:szCs w:val="20"/>
                 <w:lang w:val="en-US"/>
               </w:rPr>
               <w:t>.</w:t>
             </w:r>
             <w:r>
               <w:rPr>
+                <w:sz w:val="20"/>
+                <w:szCs w:val="20"/>
                 <w:lang w:val="en-US"/>
               </w:rPr>
               <w:t xml:space="preserve"> </w:t>
@@ -208,6 +231,8 @@
               <w:rPr>
                 <w:b/>
                 <w:bCs/>
+                <w:sz w:val="20"/>
+                <w:szCs w:val="20"/>
                 <w:lang w:val="en-US"/>
               </w:rPr>
               <w:t>current_risk_max|upper</w:t>
@@ -217,6 +242,8 @@
               <w:rPr>
                 <w:b/>
                 <w:bCs/>
+                <w:sz w:val="20"/>
+                <w:szCs w:val="20"/>
                 <w:lang w:val="en-US"/>
               </w:rPr>
               <w:t xml:space="preserve"> }}</w:t>
@@ -247,6 +274,8 @@
               <w:rPr>
                 <w:b/>
                 <w:bCs/>
+                <w:sz w:val="20"/>
+                <w:szCs w:val="20"/>
                 <w:lang w:val="en-US"/>
               </w:rPr>
             </w:pPr>
@@ -265,6 +294,8 @@
             <w:pPr>
               <w:spacing w:before="0" w:after="0" w:line="240" w:lineRule="auto"/>
               <w:rPr>
+                <w:sz w:val="20"/>
+                <w:szCs w:val="20"/>
                 <w:lang w:val="en-US"/>
               </w:rPr>
             </w:pPr>
@@ -283,6 +314,8 @@
             <w:pPr>
               <w:spacing w:before="0" w:after="0" w:line="240" w:lineRule="auto"/>
               <w:rPr>
+                <w:sz w:val="20"/>
+                <w:szCs w:val="20"/>
                 <w:lang w:val="en-US"/>
               </w:rPr>
             </w:pPr>
@@ -301,6 +334,8 @@
             <w:pPr>
               <w:spacing w:before="0" w:after="0" w:line="240" w:lineRule="auto"/>
               <w:rPr>
+                <w:sz w:val="20"/>
+                <w:szCs w:val="20"/>
                 <w:lang w:val="en-US"/>
               </w:rPr>
             </w:pPr>
@@ -318,11 +353,19 @@
               <w:spacing w:before="0" w:after="0" w:line="240" w:lineRule="auto"/>
               <w:jc w:val="right"/>
               <w:rPr>
-                <w:lang w:val="en-US"/>
-              </w:rPr>
-            </w:pPr>
-            <w:r>
-              <w:rPr>
+                <w:b/>
+                <w:bCs/>
+                <w:sz w:val="20"/>
+                <w:szCs w:val="20"/>
+                <w:lang w:val="en-US"/>
+              </w:rPr>
+            </w:pPr>
+            <w:r>
+              <w:rPr>
+                <w:b/>
+                <w:bCs/>
+                <w:sz w:val="20"/>
+                <w:szCs w:val="20"/>
                 <w:lang w:val="en-US"/>
               </w:rPr>
               <w:t>{%</w:t>
@@ -330,46 +373,24 @@
             <w:proofErr w:type="spellStart"/>
             <w:r>
               <w:rPr>
-                <w:lang w:val="en-US"/>
-              </w:rPr>
-              <w:t>t</w:t>
-            </w:r>
-            <w:r>
-              <w:rPr>
-                <w:lang w:val="en-US"/>
-              </w:rPr>
-              <w:t>c</w:t>
+                <w:b/>
+                <w:bCs/>
+                <w:sz w:val="20"/>
+                <w:szCs w:val="20"/>
+                <w:lang w:val="en-US"/>
+              </w:rPr>
+              <w:t>tc</w:t>
             </w:r>
             <w:proofErr w:type="spellEnd"/>
             <w:r>
               <w:rPr>
-                <w:lang w:val="en-US"/>
-              </w:rPr>
-              <w:t xml:space="preserve"> for </w:t>
-            </w:r>
-            <w:r>
-              <w:rPr>
-                <w:lang w:val="en-US"/>
-              </w:rPr>
-              <w:t xml:space="preserve">year </w:t>
-            </w:r>
-            <w:r>
-              <w:rPr>
-                <w:lang w:val="en-US"/>
-              </w:rPr>
-              <w:t xml:space="preserve">in </w:t>
-            </w:r>
-            <w:r>
-              <w:rPr>
-                <w:lang w:val="en-US"/>
-              </w:rPr>
-              <w:t>years</w:t>
-            </w:r>
-            <w:r>
-              <w:rPr>
-                <w:lang w:val="en-US"/>
-              </w:rPr>
-              <w:t xml:space="preserve"> %}</w:t>
+                <w:b/>
+                <w:bCs/>
+                <w:sz w:val="20"/>
+                <w:szCs w:val="20"/>
+                <w:lang w:val="en-US"/>
+              </w:rPr>
+              <w:t xml:space="preserve"> for year in years %}</w:t>
             </w:r>
           </w:p>
         </w:tc>
@@ -386,8 +407,20 @@
             <w:pPr>
               <w:spacing w:before="0" w:after="0" w:line="240" w:lineRule="auto"/>
               <w:jc w:val="right"/>
-            </w:pPr>
-            <w:r>
+              <w:rPr>
+                <w:b/>
+                <w:bCs/>
+                <w:sz w:val="20"/>
+                <w:szCs w:val="20"/>
+              </w:rPr>
+            </w:pPr>
+            <w:r>
+              <w:rPr>
+                <w:b/>
+                <w:bCs/>
+                <w:sz w:val="20"/>
+                <w:szCs w:val="20"/>
+              </w:rPr>
               <w:t>{{ year }}</w:t>
             </w:r>
           </w:p>
@@ -406,8 +439,20 @@
             <w:pPr>
               <w:spacing w:before="0" w:after="0" w:line="240" w:lineRule="auto"/>
               <w:jc w:val="right"/>
-            </w:pPr>
-            <w:r>
+              <w:rPr>
+                <w:b/>
+                <w:bCs/>
+                <w:sz w:val="20"/>
+                <w:szCs w:val="20"/>
+              </w:rPr>
+            </w:pPr>
+            <w:r>
+              <w:rPr>
+                <w:b/>
+                <w:bCs/>
+                <w:sz w:val="20"/>
+                <w:szCs w:val="20"/>
+              </w:rPr>
               <w:t>{%tc endfor %}}</w:t>
             </w:r>
           </w:p>
@@ -430,11 +475,15 @@
               <w:spacing w:before="0" w:after="0" w:line="240" w:lineRule="auto"/>
               <w:jc w:val="left"/>
               <w:rPr>
-                <w:lang w:val="en-US"/>
-              </w:rPr>
-            </w:pPr>
-            <w:r>
-              <w:rPr>
+                <w:sz w:val="20"/>
+                <w:szCs w:val="20"/>
+                <w:lang w:val="en-US"/>
+              </w:rPr>
+            </w:pPr>
+            <w:r>
+              <w:rPr>
+                <w:sz w:val="20"/>
+                <w:szCs w:val="20"/>
                 <w:lang w:val="en-US"/>
               </w:rPr>
               <w:t>{%tr for row in table %}</w:t>
@@ -460,6 +509,8 @@
               <w:rPr>
                 <w:b/>
                 <w:bCs/>
+                <w:sz w:val="20"/>
+                <w:szCs w:val="20"/>
                 <w:lang w:val="en-US"/>
               </w:rPr>
             </w:pPr>
@@ -468,6 +519,8 @@
               <w:rPr>
                 <w:b/>
                 <w:bCs/>
+                <w:sz w:val="20"/>
+                <w:szCs w:val="20"/>
                 <w:lang w:val="en-US"/>
               </w:rPr>
               <w:t>R</w:t>
@@ -476,6 +529,8 @@
               <w:rPr>
                 <w:b/>
                 <w:bCs/>
+                <w:sz w:val="20"/>
+                <w:szCs w:val="20"/>
                 <w:lang w:val="en-US"/>
               </w:rPr>
               <w:t>{</w:t>
@@ -485,6 +540,8 @@
               <w:rPr>
                 <w:b/>
                 <w:bCs/>
+                <w:sz w:val="20"/>
+                <w:szCs w:val="20"/>
                 <w:lang w:val="en-US"/>
               </w:rPr>
               <w:t>{ row.id }}</w:t>
@@ -505,12 +562,16 @@
               <w:spacing w:before="0" w:after="0" w:line="240" w:lineRule="auto"/>
               <w:jc w:val="left"/>
               <w:rPr>
+                <w:sz w:val="20"/>
+                <w:szCs w:val="20"/>
                 <w:lang w:val="en-US"/>
               </w:rPr>
             </w:pPr>
             <w:proofErr w:type="gramStart"/>
             <w:r>
               <w:rPr>
+                <w:sz w:val="20"/>
+                <w:szCs w:val="20"/>
                 <w:lang w:val="en-US"/>
               </w:rPr>
               <w:t xml:space="preserve">{{ </w:t>
@@ -518,6 +579,8 @@
             <w:proofErr w:type="spellStart"/>
             <w:r>
               <w:rPr>
+                <w:sz w:val="20"/>
+                <w:szCs w:val="20"/>
                 <w:lang w:val="en-US"/>
               </w:rPr>
               <w:t>row</w:t>
@@ -525,6 +588,8 @@
             <w:proofErr w:type="gramEnd"/>
             <w:r>
               <w:rPr>
+                <w:sz w:val="20"/>
+                <w:szCs w:val="20"/>
                 <w:lang w:val="en-US"/>
               </w:rPr>
               <w:t>.service</w:t>
@@ -532,6 +597,8 @@
             <w:proofErr w:type="spellEnd"/>
             <w:r>
               <w:rPr>
+                <w:sz w:val="20"/>
+                <w:szCs w:val="20"/>
                 <w:lang w:val="en-US"/>
               </w:rPr>
               <w:t xml:space="preserve"> }} &gt; {{ </w:t>
@@ -539,6 +606,8 @@
             <w:proofErr w:type="spellStart"/>
             <w:r>
               <w:rPr>
+                <w:sz w:val="20"/>
+                <w:szCs w:val="20"/>
                 <w:lang w:val="en-US"/>
               </w:rPr>
               <w:t>row.asset</w:t>
@@ -546,6 +615,8 @@
             <w:proofErr w:type="spellEnd"/>
             <w:r>
               <w:rPr>
+                <w:sz w:val="20"/>
+                <w:szCs w:val="20"/>
                 <w:lang w:val="en-US"/>
               </w:rPr>
               <w:t xml:space="preserve"> }}</w:t>
@@ -566,12 +637,16 @@
               <w:spacing w:before="0" w:after="0" w:line="240" w:lineRule="auto"/>
               <w:jc w:val="left"/>
               <w:rPr>
+                <w:sz w:val="20"/>
+                <w:szCs w:val="20"/>
                 <w:lang w:val="en-US"/>
               </w:rPr>
             </w:pPr>
             <w:proofErr w:type="gramStart"/>
             <w:r>
               <w:rPr>
+                <w:sz w:val="20"/>
+                <w:szCs w:val="20"/>
                 <w:lang w:val="en-US"/>
               </w:rPr>
               <w:t xml:space="preserve">{{ </w:t>
@@ -579,6 +654,8 @@
             <w:proofErr w:type="spellStart"/>
             <w:r>
               <w:rPr>
+                <w:sz w:val="20"/>
+                <w:szCs w:val="20"/>
                 <w:lang w:val="en-US"/>
               </w:rPr>
               <w:t>row</w:t>
@@ -586,6 +663,8 @@
             <w:proofErr w:type="gramEnd"/>
             <w:r>
               <w:rPr>
+                <w:sz w:val="20"/>
+                <w:szCs w:val="20"/>
                 <w:lang w:val="en-US"/>
               </w:rPr>
               <w:t>.threat</w:t>
@@ -593,6 +672,8 @@
             <w:proofErr w:type="spellEnd"/>
             <w:r>
               <w:rPr>
+                <w:sz w:val="20"/>
+                <w:szCs w:val="20"/>
                 <w:lang w:val="en-US"/>
               </w:rPr>
               <w:t xml:space="preserve"> }}</w:t>
@@ -613,12 +694,16 @@
               <w:spacing w:before="0" w:after="0" w:line="240" w:lineRule="auto"/>
               <w:jc w:val="left"/>
               <w:rPr>
+                <w:sz w:val="20"/>
+                <w:szCs w:val="20"/>
                 <w:lang w:val="en-US"/>
               </w:rPr>
             </w:pPr>
             <w:proofErr w:type="gramStart"/>
             <w:r>
               <w:rPr>
+                <w:sz w:val="20"/>
+                <w:szCs w:val="20"/>
                 <w:lang w:val="en-US"/>
               </w:rPr>
               <w:t>{{ row</w:t>
@@ -626,30 +711,34 @@
             <w:proofErr w:type="gramEnd"/>
             <w:r>
               <w:rPr>
+                <w:sz w:val="20"/>
+                <w:szCs w:val="20"/>
                 <w:lang w:val="en-US"/>
               </w:rPr>
               <w:t>.</w:t>
             </w:r>
             <w:r>
+              <w:rPr>
+                <w:sz w:val="20"/>
+                <w:szCs w:val="20"/>
+              </w:rPr>
               <w:t xml:space="preserve"> </w:t>
             </w:r>
             <w:r>
               <w:rPr>
+                <w:sz w:val="20"/>
+                <w:szCs w:val="20"/>
                 <w:lang w:val="en-US"/>
               </w:rPr>
               <w:t>v</w:t>
             </w:r>
             <w:r>
               <w:rPr>
-                <w:lang w:val="en-US"/>
-              </w:rPr>
-              <w:t>ulnerability</w:t>
-            </w:r>
-            <w:r>
-              <w:rPr>
-                <w:lang w:val="en-US"/>
-              </w:rPr>
-              <w:t xml:space="preserve"> }}</w:t>
+                <w:sz w:val="20"/>
+                <w:szCs w:val="20"/>
+                <w:lang w:val="en-US"/>
+              </w:rPr>
+              <w:t>ulnerability }}</w:t>
             </w:r>
           </w:p>
         </w:tc>
@@ -666,11 +755,15 @@
               <w:spacing w:before="0" w:after="0" w:line="240" w:lineRule="auto"/>
               <w:jc w:val="right"/>
               <w:rPr>
-                <w:lang w:val="en-US"/>
-              </w:rPr>
-            </w:pPr>
-            <w:r>
-              <w:rPr>
+                <w:sz w:val="20"/>
+                <w:szCs w:val="20"/>
+                <w:lang w:val="en-US"/>
+              </w:rPr>
+            </w:pPr>
+            <w:r>
+              <w:rPr>
+                <w:sz w:val="20"/>
+                <w:szCs w:val="20"/>
                 <w:lang w:val="en-US"/>
               </w:rPr>
               <w:t>{%</w:t>
@@ -678,46 +771,20 @@
             <w:proofErr w:type="spellStart"/>
             <w:r>
               <w:rPr>
-                <w:lang w:val="en-US"/>
-              </w:rPr>
-              <w:t>t</w:t>
-            </w:r>
-            <w:r>
-              <w:rPr>
-                <w:lang w:val="en-US"/>
-              </w:rPr>
-              <w:t>c</w:t>
+                <w:sz w:val="20"/>
+                <w:szCs w:val="20"/>
+                <w:lang w:val="en-US"/>
+              </w:rPr>
+              <w:t>tc</w:t>
             </w:r>
             <w:proofErr w:type="spellEnd"/>
             <w:r>
               <w:rPr>
-                <w:lang w:val="en-US"/>
-              </w:rPr>
-              <w:t xml:space="preserve"> for </w:t>
-            </w:r>
-            <w:r>
-              <w:rPr>
-                <w:lang w:val="en-US"/>
-              </w:rPr>
-              <w:t xml:space="preserve">year </w:t>
-            </w:r>
-            <w:r>
-              <w:rPr>
-                <w:lang w:val="en-US"/>
-              </w:rPr>
-              <w:t xml:space="preserve">in </w:t>
-            </w:r>
-            <w:r>
-              <w:rPr>
-                <w:lang w:val="en-US"/>
-              </w:rPr>
-              <w:t>years</w:t>
-            </w:r>
-            <w:r>
-              <w:rPr>
-                <w:lang w:val="en-US"/>
-              </w:rPr>
-              <w:t xml:space="preserve"> %}</w:t>
+                <w:sz w:val="20"/>
+                <w:szCs w:val="20"/>
+                <w:lang w:val="en-US"/>
+              </w:rPr>
+              <w:t xml:space="preserve"> for year in years %}</w:t>
             </w:r>
           </w:p>
         </w:tc>
@@ -735,12 +802,16 @@
               <w:spacing w:before="0" w:after="0" w:line="240" w:lineRule="auto"/>
               <w:jc w:val="right"/>
               <w:rPr>
+                <w:sz w:val="20"/>
+                <w:szCs w:val="20"/>
                 <w:lang w:val="en-US"/>
               </w:rPr>
             </w:pPr>
             <w:proofErr w:type="gramStart"/>
             <w:r>
               <w:rPr>
+                <w:sz w:val="20"/>
+                <w:szCs w:val="20"/>
                 <w:lang w:val="en-US"/>
               </w:rPr>
               <w:t xml:space="preserve">{{ </w:t>
@@ -748,6 +819,8 @@
             <w:proofErr w:type="spellStart"/>
             <w:r>
               <w:rPr>
+                <w:sz w:val="20"/>
+                <w:szCs w:val="20"/>
                 <w:lang w:val="en-US"/>
               </w:rPr>
               <w:t>row</w:t>
@@ -755,6 +828,8 @@
             <w:proofErr w:type="gramEnd"/>
             <w:r>
               <w:rPr>
+                <w:sz w:val="20"/>
+                <w:szCs w:val="20"/>
                 <w:lang w:val="en-US"/>
               </w:rPr>
               <w:t>.risks_values</w:t>
@@ -762,15 +837,11 @@
             <w:proofErr w:type="spellEnd"/>
             <w:r>
               <w:rPr>
-                <w:lang w:val="en-US"/>
-              </w:rPr>
-              <w:t>[year]['max']  }}</w:t>
-            </w:r>
-            <w:r>
-              <w:rPr>
-                <w:lang w:val="en-US"/>
-              </w:rPr>
-              <w:t xml:space="preserve"> </w:t>
+                <w:sz w:val="20"/>
+                <w:szCs w:val="20"/>
+                <w:lang w:val="en-US"/>
+              </w:rPr>
+              <w:t xml:space="preserve">[year]['max']  }} </w:t>
             </w:r>
           </w:p>
         </w:tc>
@@ -790,10 +861,16 @@
               <w:spacing w:before="0" w:after="0" w:line="240" w:lineRule="auto"/>
               <w:jc w:val="right"/>
               <w:rPr>
-                <w:lang w:val="en-US"/>
-              </w:rPr>
-            </w:pPr>
-            <w:r>
+                <w:sz w:val="20"/>
+                <w:szCs w:val="20"/>
+                <w:lang w:val="en-US"/>
+              </w:rPr>
+            </w:pPr>
+            <w:r>
+              <w:rPr>
+                <w:sz w:val="20"/>
+                <w:szCs w:val="20"/>
+              </w:rPr>
               <w:t>{%tc endfor %}}</w:t>
             </w:r>
           </w:p>
@@ -815,11 +892,15 @@
               <w:spacing w:before="0" w:after="0" w:line="240" w:lineRule="auto"/>
               <w:jc w:val="left"/>
               <w:rPr>
-                <w:lang w:val="en-US"/>
-              </w:rPr>
-            </w:pPr>
-            <w:r>
-              <w:rPr>
+                <w:sz w:val="20"/>
+                <w:szCs w:val="20"/>
+                <w:lang w:val="en-US"/>
+              </w:rPr>
+            </w:pPr>
+            <w:r>
+              <w:rPr>
+                <w:sz w:val="20"/>
+                <w:szCs w:val="20"/>
                 <w:lang w:val="en-US"/>
               </w:rPr>
               <w:t xml:space="preserve">{%tr </w:t>
@@ -827,6 +908,8 @@
             <w:proofErr w:type="spellStart"/>
             <w:r>
               <w:rPr>
+                <w:sz w:val="20"/>
+                <w:szCs w:val="20"/>
                 <w:lang w:val="en-US"/>
               </w:rPr>
               <w:t>endfor</w:t>
@@ -834,6 +917,8 @@
             <w:proofErr w:type="spellEnd"/>
             <w:r>
               <w:rPr>
+                <w:sz w:val="20"/>
+                <w:szCs w:val="20"/>
                 <w:lang w:val="en-US"/>
               </w:rPr>
               <w:t xml:space="preserve"> %}</w:t>

</xml_diff>

<commit_message>
[reporting][subdoc]Fixed colspan header in table_of_evolution_of_the_highest_risks, comment #639
</commit_message>
<xml_diff>
--- a/reporting/subdocs_templates/table_of_evolution_of_the_highest_risks_template.docx
+++ b/reporting/subdocs_templates/table_of_evolution_of_the_highest_risks_template.docx
@@ -196,27 +196,79 @@
                 <w:lang w:val="en-US"/>
               </w:rPr>
             </w:pPr>
-            <w:proofErr w:type="gramStart"/>
-            <w:r>
-              <w:rPr>
-                <w:b/>
-                <w:bCs/>
-                <w:sz w:val="20"/>
-                <w:szCs w:val="20"/>
-                <w:lang w:val="en-US"/>
-              </w:rPr>
-              <w:t>{{ translations</w:t>
-            </w:r>
-            <w:proofErr w:type="gramEnd"/>
-            <w:r>
-              <w:rPr>
-                <w:b/>
-                <w:bCs/>
-                <w:sz w:val="20"/>
-                <w:szCs w:val="20"/>
-                <w:lang w:val="en-US"/>
-              </w:rPr>
-              <w:t>.</w:t>
+            <w:r>
+              <w:rPr>
+                <w:b/>
+                <w:bCs/>
+                <w:sz w:val="20"/>
+                <w:szCs w:val="20"/>
+                <w:lang w:val="en-US"/>
+              </w:rPr>
+              <w:t xml:space="preserve">{% </w:t>
+            </w:r>
+            <w:proofErr w:type="spellStart"/>
+            <w:r>
+              <w:rPr>
+                <w:b/>
+                <w:bCs/>
+                <w:sz w:val="20"/>
+                <w:szCs w:val="20"/>
+                <w:lang w:val="en-US"/>
+              </w:rPr>
+              <w:t>colspan</w:t>
+            </w:r>
+            <w:proofErr w:type="spellEnd"/>
+            <w:r>
+              <w:rPr>
+                <w:b/>
+                <w:bCs/>
+                <w:sz w:val="20"/>
+                <w:szCs w:val="20"/>
+                <w:lang w:val="en-US"/>
+              </w:rPr>
+              <w:t xml:space="preserve"> </w:t>
+            </w:r>
+            <w:proofErr w:type="spellStart"/>
+            <w:r>
+              <w:rPr>
+                <w:b/>
+                <w:bCs/>
+                <w:sz w:val="20"/>
+                <w:szCs w:val="20"/>
+                <w:lang w:val="en-US"/>
+              </w:rPr>
+              <w:t>years|length</w:t>
+            </w:r>
+            <w:proofErr w:type="spellEnd"/>
+            <w:r>
+              <w:rPr>
+                <w:b/>
+                <w:bCs/>
+                <w:sz w:val="20"/>
+                <w:szCs w:val="20"/>
+                <w:lang w:val="en-US"/>
+              </w:rPr>
+              <w:t xml:space="preserve"> </w:t>
+            </w:r>
+            <w:r>
+              <w:rPr>
+                <w:b/>
+                <w:bCs/>
+                <w:sz w:val="20"/>
+                <w:szCs w:val="20"/>
+                <w:lang w:val="en-US"/>
+              </w:rPr>
+              <w:t xml:space="preserve"> %}</w:t>
+            </w:r>
+            <w:r>
+              <w:rPr>
+                <w:b/>
+                <w:bCs/>
+                <w:sz w:val="20"/>
+                <w:szCs w:val="20"/>
+                <w:lang w:val="en-US"/>
+              </w:rPr>
+              <w:t>{{ translations.</w:t>
             </w:r>
             <w:r>
               <w:rPr>
@@ -514,7 +566,6 @@
                 <w:lang w:val="en-US"/>
               </w:rPr>
             </w:pPr>
-            <w:proofErr w:type="gramStart"/>
             <w:r>
               <w:rPr>
                 <w:b/>
@@ -533,18 +584,7 @@
                 <w:szCs w:val="20"/>
                 <w:lang w:val="en-US"/>
               </w:rPr>
-              <w:t>{</w:t>
-            </w:r>
-            <w:proofErr w:type="gramEnd"/>
-            <w:r>
-              <w:rPr>
-                <w:b/>
-                <w:bCs/>
-                <w:sz w:val="20"/>
-                <w:szCs w:val="20"/>
-                <w:lang w:val="en-US"/>
-              </w:rPr>
-              <w:t>{ row.id }}</w:t>
+              <w:t>{{ row.id }}</w:t>
             </w:r>
           </w:p>
         </w:tc>
@@ -567,7 +607,6 @@
                 <w:lang w:val="en-US"/>
               </w:rPr>
             </w:pPr>
-            <w:proofErr w:type="gramStart"/>
             <w:r>
               <w:rPr>
                 <w:sz w:val="20"/>
@@ -583,16 +622,7 @@
                 <w:szCs w:val="20"/>
                 <w:lang w:val="en-US"/>
               </w:rPr>
-              <w:t>row</w:t>
-            </w:r>
-            <w:proofErr w:type="gramEnd"/>
-            <w:r>
-              <w:rPr>
-                <w:sz w:val="20"/>
-                <w:szCs w:val="20"/>
-                <w:lang w:val="en-US"/>
-              </w:rPr>
-              <w:t>.service</w:t>
+              <w:t>row.service</w:t>
             </w:r>
             <w:proofErr w:type="spellEnd"/>
             <w:r>
@@ -642,7 +672,6 @@
                 <w:lang w:val="en-US"/>
               </w:rPr>
             </w:pPr>
-            <w:proofErr w:type="gramStart"/>
             <w:r>
               <w:rPr>
                 <w:sz w:val="20"/>
@@ -658,16 +687,7 @@
                 <w:szCs w:val="20"/>
                 <w:lang w:val="en-US"/>
               </w:rPr>
-              <w:t>row</w:t>
-            </w:r>
-            <w:proofErr w:type="gramEnd"/>
-            <w:r>
-              <w:rPr>
-                <w:sz w:val="20"/>
-                <w:szCs w:val="20"/>
-                <w:lang w:val="en-US"/>
-              </w:rPr>
-              <w:t>.threat</w:t>
+              <w:t>row.threat</w:t>
             </w:r>
             <w:proofErr w:type="spellEnd"/>
             <w:r>
@@ -699,23 +719,13 @@
                 <w:lang w:val="en-US"/>
               </w:rPr>
             </w:pPr>
-            <w:proofErr w:type="gramStart"/>
-            <w:r>
-              <w:rPr>
-                <w:sz w:val="20"/>
-                <w:szCs w:val="20"/>
-                <w:lang w:val="en-US"/>
-              </w:rPr>
-              <w:t>{{ row</w:t>
-            </w:r>
-            <w:proofErr w:type="gramEnd"/>
-            <w:r>
-              <w:rPr>
-                <w:sz w:val="20"/>
-                <w:szCs w:val="20"/>
-                <w:lang w:val="en-US"/>
-              </w:rPr>
-              <w:t>.</w:t>
+            <w:r>
+              <w:rPr>
+                <w:sz w:val="20"/>
+                <w:szCs w:val="20"/>
+                <w:lang w:val="en-US"/>
+              </w:rPr>
+              <w:t>{{ row.</w:t>
             </w:r>
             <w:r>
               <w:rPr>
@@ -807,7 +817,6 @@
                 <w:lang w:val="en-US"/>
               </w:rPr>
             </w:pPr>
-            <w:proofErr w:type="gramStart"/>
             <w:r>
               <w:rPr>
                 <w:sz w:val="20"/>
@@ -823,16 +832,7 @@
                 <w:szCs w:val="20"/>
                 <w:lang w:val="en-US"/>
               </w:rPr>
-              <w:t>row</w:t>
-            </w:r>
-            <w:proofErr w:type="gramEnd"/>
-            <w:r>
-              <w:rPr>
-                <w:sz w:val="20"/>
-                <w:szCs w:val="20"/>
-                <w:lang w:val="en-US"/>
-              </w:rPr>
-              <w:t>.risks_values</w:t>
+              <w:t>row.risks_values</w:t>
             </w:r>
             <w:proofErr w:type="spellEnd"/>
             <w:r>

</xml_diff>

<commit_message>
[reporting][subdocs]Fixed colspan in table_of_evolution_of_the_highest_risks_template, comment #639
</commit_message>
<xml_diff>
--- a/reporting/subdocs_templates/table_of_evolution_of_the_highest_risks_template.docx
+++ b/reporting/subdocs_templates/table_of_evolution_of_the_highest_risks_template.docx
@@ -23,12 +23,11 @@
         <w:gridCol w:w="1274"/>
         <w:gridCol w:w="1417"/>
         <w:gridCol w:w="968"/>
-        <w:gridCol w:w="968"/>
-        <w:gridCol w:w="13"/>
+        <w:gridCol w:w="981"/>
       </w:tblGrid>
       <w:tr>
         <w:trPr>
-          <w:trHeight w:val="20"/>
+          <w:trHeight w:val="340"/>
         </w:trPr>
         <w:tc>
           <w:tcPr>
@@ -36,8 +35,7 @@
             <w:vMerge w:val="restart"/>
             <w:tcBorders>
               <w:top w:val="single" w:sz="12" w:space="0" w:color="auto"/>
-              <w:left w:val="nil"/>
-              <w:bottom w:val="single" w:sz="12" w:space="0" w:color="auto"/>
+              <w:left w:val="single" w:sz="12" w:space="0" w:color="FFFFFF" w:themeColor="background1"/>
             </w:tcBorders>
             <w:vAlign w:val="center"/>
           </w:tcPr>
@@ -50,16 +48,53 @@
                 <w:bCs/>
                 <w:sz w:val="20"/>
                 <w:szCs w:val="20"/>
-              </w:rPr>
-            </w:pPr>
-            <w:r>
-              <w:rPr>
-                <w:b/>
-                <w:bCs/>
-                <w:sz w:val="20"/>
-                <w:szCs w:val="20"/>
-              </w:rPr>
-              <w:t>{{ translations.id|upper }}</w:t>
+                <w:lang w:val="en-US"/>
+              </w:rPr>
+            </w:pPr>
+            <w:bookmarkStart w:id="0" w:name="_Hlk223688335"/>
+            <w:proofErr w:type="gramStart"/>
+            <w:r>
+              <w:rPr>
+                <w:b/>
+                <w:bCs/>
+                <w:sz w:val="20"/>
+                <w:szCs w:val="20"/>
+                <w:lang w:val="en-US"/>
+              </w:rPr>
+              <w:t xml:space="preserve">{{ </w:t>
+            </w:r>
+            <w:proofErr w:type="spellStart"/>
+            <w:r>
+              <w:rPr>
+                <w:b/>
+                <w:bCs/>
+                <w:sz w:val="20"/>
+                <w:szCs w:val="20"/>
+                <w:lang w:val="en-US"/>
+              </w:rPr>
+              <w:t>translations.id</w:t>
+            </w:r>
+            <w:proofErr w:type="gramEnd"/>
+            <w:r>
+              <w:rPr>
+                <w:b/>
+                <w:bCs/>
+                <w:sz w:val="20"/>
+                <w:szCs w:val="20"/>
+                <w:lang w:val="en-US"/>
+              </w:rPr>
+              <w:t>|upper</w:t>
+            </w:r>
+            <w:proofErr w:type="spellEnd"/>
+            <w:r>
+              <w:rPr>
+                <w:b/>
+                <w:bCs/>
+                <w:sz w:val="20"/>
+                <w:szCs w:val="20"/>
+                <w:lang w:val="en-US"/>
+              </w:rPr>
+              <w:t xml:space="preserve"> }}</w:t>
             </w:r>
           </w:p>
         </w:tc>
@@ -69,7 +104,6 @@
             <w:vMerge w:val="restart"/>
             <w:tcBorders>
               <w:top w:val="single" w:sz="12" w:space="0" w:color="auto"/>
-              <w:bottom w:val="single" w:sz="12" w:space="0" w:color="666666"/>
             </w:tcBorders>
             <w:vAlign w:val="center"/>
           </w:tcPr>
@@ -82,16 +116,52 @@
                 <w:bCs/>
                 <w:sz w:val="20"/>
                 <w:szCs w:val="20"/>
-              </w:rPr>
-            </w:pPr>
-            <w:r>
-              <w:rPr>
-                <w:b/>
-                <w:bCs/>
-                <w:sz w:val="20"/>
-                <w:szCs w:val="20"/>
-              </w:rPr>
-              <w:t>{{ translations.asset|upper }}</w:t>
+                <w:lang w:val="en-US"/>
+              </w:rPr>
+            </w:pPr>
+            <w:proofErr w:type="gramStart"/>
+            <w:r>
+              <w:rPr>
+                <w:b/>
+                <w:bCs/>
+                <w:sz w:val="20"/>
+                <w:szCs w:val="20"/>
+                <w:lang w:val="en-US"/>
+              </w:rPr>
+              <w:t xml:space="preserve">{{ </w:t>
+            </w:r>
+            <w:proofErr w:type="spellStart"/>
+            <w:r>
+              <w:rPr>
+                <w:b/>
+                <w:bCs/>
+                <w:sz w:val="20"/>
+                <w:szCs w:val="20"/>
+                <w:lang w:val="en-US"/>
+              </w:rPr>
+              <w:t>translations</w:t>
+            </w:r>
+            <w:proofErr w:type="gramEnd"/>
+            <w:r>
+              <w:rPr>
+                <w:b/>
+                <w:bCs/>
+                <w:sz w:val="20"/>
+                <w:szCs w:val="20"/>
+                <w:lang w:val="en-US"/>
+              </w:rPr>
+              <w:t>.asset|upper</w:t>
+            </w:r>
+            <w:proofErr w:type="spellEnd"/>
+            <w:r>
+              <w:rPr>
+                <w:b/>
+                <w:bCs/>
+                <w:sz w:val="20"/>
+                <w:szCs w:val="20"/>
+                <w:lang w:val="en-US"/>
+              </w:rPr>
+              <w:t xml:space="preserve"> }}</w:t>
             </w:r>
           </w:p>
         </w:tc>
@@ -101,7 +171,6 @@
             <w:vMerge w:val="restart"/>
             <w:tcBorders>
               <w:top w:val="single" w:sz="12" w:space="0" w:color="auto"/>
-              <w:bottom w:val="single" w:sz="12" w:space="0" w:color="666666"/>
             </w:tcBorders>
             <w:vAlign w:val="center"/>
           </w:tcPr>
@@ -114,16 +183,52 @@
                 <w:bCs/>
                 <w:sz w:val="20"/>
                 <w:szCs w:val="20"/>
-              </w:rPr>
-            </w:pPr>
-            <w:r>
-              <w:rPr>
-                <w:b/>
-                <w:bCs/>
-                <w:sz w:val="20"/>
-                <w:szCs w:val="20"/>
-              </w:rPr>
-              <w:t>{{ translations.threat|upper }}</w:t>
+                <w:lang w:val="en-US"/>
+              </w:rPr>
+            </w:pPr>
+            <w:proofErr w:type="gramStart"/>
+            <w:r>
+              <w:rPr>
+                <w:b/>
+                <w:bCs/>
+                <w:sz w:val="20"/>
+                <w:szCs w:val="20"/>
+                <w:lang w:val="en-US"/>
+              </w:rPr>
+              <w:t xml:space="preserve">{{ </w:t>
+            </w:r>
+            <w:proofErr w:type="spellStart"/>
+            <w:r>
+              <w:rPr>
+                <w:b/>
+                <w:bCs/>
+                <w:sz w:val="20"/>
+                <w:szCs w:val="20"/>
+                <w:lang w:val="en-US"/>
+              </w:rPr>
+              <w:t>translations</w:t>
+            </w:r>
+            <w:proofErr w:type="gramEnd"/>
+            <w:r>
+              <w:rPr>
+                <w:b/>
+                <w:bCs/>
+                <w:sz w:val="20"/>
+                <w:szCs w:val="20"/>
+                <w:lang w:val="en-US"/>
+              </w:rPr>
+              <w:t>.threat|upper</w:t>
+            </w:r>
+            <w:proofErr w:type="spellEnd"/>
+            <w:r>
+              <w:rPr>
+                <w:b/>
+                <w:bCs/>
+                <w:sz w:val="20"/>
+                <w:szCs w:val="20"/>
+                <w:lang w:val="en-US"/>
+              </w:rPr>
+              <w:t xml:space="preserve"> }}</w:t>
             </w:r>
           </w:p>
         </w:tc>
@@ -133,7 +238,6 @@
             <w:vMerge w:val="restart"/>
             <w:tcBorders>
               <w:top w:val="single" w:sz="12" w:space="0" w:color="auto"/>
-              <w:bottom w:val="single" w:sz="12" w:space="0" w:color="666666"/>
             </w:tcBorders>
             <w:vAlign w:val="center"/>
           </w:tcPr>
@@ -146,66 +250,109 @@
                 <w:bCs/>
                 <w:sz w:val="20"/>
                 <w:szCs w:val="20"/>
-              </w:rPr>
-            </w:pPr>
-            <w:r>
-              <w:rPr>
-                <w:b/>
-                <w:bCs/>
-                <w:sz w:val="20"/>
-                <w:szCs w:val="20"/>
-              </w:rPr>
-              <w:t>{{ translations.</w:t>
-            </w:r>
-            <w:r>
-              <w:rPr>
-                <w:sz w:val="20"/>
-                <w:szCs w:val="20"/>
+                <w:lang w:val="en-US"/>
+              </w:rPr>
+            </w:pPr>
+            <w:proofErr w:type="gramStart"/>
+            <w:r>
+              <w:rPr>
+                <w:b/>
+                <w:bCs/>
+                <w:sz w:val="20"/>
+                <w:szCs w:val="20"/>
+                <w:lang w:val="en-US"/>
+              </w:rPr>
+              <w:t>{{ translations</w:t>
+            </w:r>
+            <w:proofErr w:type="gramEnd"/>
+            <w:r>
+              <w:rPr>
+                <w:b/>
+                <w:bCs/>
+                <w:sz w:val="20"/>
+                <w:szCs w:val="20"/>
+                <w:lang w:val="en-US"/>
+              </w:rPr>
+              <w:t xml:space="preserve">. </w:t>
+            </w:r>
+            <w:proofErr w:type="spellStart"/>
+            <w:r>
+              <w:rPr>
+                <w:b/>
+                <w:bCs/>
+                <w:sz w:val="20"/>
+                <w:szCs w:val="20"/>
+                <w:lang w:val="en-US"/>
+              </w:rPr>
+              <w:t>vulnerability|upper</w:t>
+            </w:r>
+            <w:proofErr w:type="spellEnd"/>
+            <w:r>
+              <w:rPr>
+                <w:b/>
+                <w:bCs/>
+                <w:sz w:val="20"/>
+                <w:szCs w:val="20"/>
+                <w:lang w:val="en-US"/>
+              </w:rPr>
+              <w:t xml:space="preserve"> }}</w:t>
+            </w:r>
+          </w:p>
+        </w:tc>
+        <w:tc>
+          <w:tcPr>
+            <w:tcW w:w="3366" w:type="dxa"/>
+            <w:gridSpan w:val="3"/>
+            <w:tcBorders>
+              <w:top w:val="single" w:sz="12" w:space="0" w:color="auto"/>
+              <w:right w:val="single" w:sz="12" w:space="0" w:color="FFFFFF" w:themeColor="background1"/>
+            </w:tcBorders>
+            <w:vAlign w:val="center"/>
+          </w:tcPr>
+          <w:p>
+            <w:pPr>
+              <w:spacing w:before="0" w:after="0" w:line="240" w:lineRule="auto"/>
+              <w:jc w:val="right"/>
+              <w:rPr>
+                <w:b/>
+                <w:bCs/>
+                <w:sz w:val="20"/>
+                <w:szCs w:val="20"/>
+                <w:lang w:val="en-US"/>
+              </w:rPr>
+            </w:pPr>
+            <w:r>
+              <w:rPr>
+                <w:b/>
+                <w:bCs/>
+                <w:sz w:val="20"/>
+                <w:szCs w:val="20"/>
+                <w:lang w:val="en-US"/>
+              </w:rPr>
+              <w:t xml:space="preserve">{% </w:t>
+            </w:r>
+            <w:proofErr w:type="spellStart"/>
+            <w:r>
+              <w:rPr>
+                <w:b/>
+                <w:bCs/>
+                <w:sz w:val="20"/>
+                <w:szCs w:val="20"/>
+                <w:lang w:val="en-US"/>
+              </w:rPr>
+              <w:t>colspan</w:t>
+            </w:r>
+            <w:proofErr w:type="spellEnd"/>
+            <w:r>
+              <w:rPr>
+                <w:b/>
+                <w:bCs/>
+                <w:sz w:val="20"/>
+                <w:szCs w:val="20"/>
+                <w:lang w:val="en-US"/>
               </w:rPr>
               <w:t xml:space="preserve"> </w:t>
             </w:r>
-            <w:r>
-              <w:rPr>
-                <w:b/>
-                <w:bCs/>
-                <w:sz w:val="20"/>
-                <w:szCs w:val="20"/>
-              </w:rPr>
-              <w:t>vulnerability|upper }}</w:t>
-            </w:r>
-          </w:p>
-        </w:tc>
-        <w:tc>
-          <w:tcPr>
-            <w:tcW w:w="3366" w:type="dxa"/>
-            <w:gridSpan w:val="4"/>
-            <w:tcBorders>
-              <w:top w:val="single" w:sz="12" w:space="0" w:color="auto"/>
-              <w:bottom w:val="single" w:sz="2" w:space="0" w:color="7F7F7F"/>
-            </w:tcBorders>
-          </w:tcPr>
-          <w:p>
-            <w:pPr>
-              <w:spacing w:before="0" w:after="0" w:line="240" w:lineRule="auto"/>
-              <w:jc w:val="right"/>
-              <w:rPr>
-                <w:b/>
-                <w:bCs/>
-                <w:sz w:val="20"/>
-                <w:szCs w:val="20"/>
-                <w:lang w:val="en-US"/>
-              </w:rPr>
-            </w:pPr>
-            <w:r>
-              <w:rPr>
-                <w:b/>
-                <w:bCs/>
-                <w:sz w:val="20"/>
-                <w:szCs w:val="20"/>
-                <w:lang w:val="en-US"/>
-              </w:rPr>
-              <w:t xml:space="preserve">{% </w:t>
-            </w:r>
             <w:proofErr w:type="spellStart"/>
             <w:r>
               <w:rPr>
@@ -215,7 +362,18 @@
                 <w:szCs w:val="20"/>
                 <w:lang w:val="en-US"/>
               </w:rPr>
-              <w:t>colspan</w:t>
+              <w:t>years|</w:t>
+            </w:r>
+            <w:proofErr w:type="gramStart"/>
+            <w:r>
+              <w:rPr>
+                <w:b/>
+                <w:bCs/>
+                <w:sz w:val="20"/>
+                <w:szCs w:val="20"/>
+                <w:lang w:val="en-US"/>
+              </w:rPr>
+              <w:t>length</w:t>
             </w:r>
             <w:proofErr w:type="spellEnd"/>
             <w:r>
@@ -226,57 +384,18 @@
                 <w:szCs w:val="20"/>
                 <w:lang w:val="en-US"/>
               </w:rPr>
-              <w:t xml:space="preserve"> </w:t>
-            </w:r>
-            <w:proofErr w:type="spellStart"/>
-            <w:r>
-              <w:rPr>
-                <w:b/>
-                <w:bCs/>
-                <w:sz w:val="20"/>
-                <w:szCs w:val="20"/>
-                <w:lang w:val="en-US"/>
-              </w:rPr>
-              <w:t>years|length</w:t>
-            </w:r>
-            <w:proofErr w:type="spellEnd"/>
-            <w:r>
-              <w:rPr>
-                <w:b/>
-                <w:bCs/>
-                <w:sz w:val="20"/>
-                <w:szCs w:val="20"/>
-                <w:lang w:val="en-US"/>
-              </w:rPr>
-              <w:t xml:space="preserve"> </w:t>
-            </w:r>
-            <w:r>
-              <w:rPr>
-                <w:b/>
-                <w:bCs/>
-                <w:sz w:val="20"/>
-                <w:szCs w:val="20"/>
-                <w:lang w:val="en-US"/>
-              </w:rPr>
-              <w:t xml:space="preserve"> %}</w:t>
-            </w:r>
-            <w:r>
-              <w:rPr>
-                <w:b/>
-                <w:bCs/>
-                <w:sz w:val="20"/>
-                <w:szCs w:val="20"/>
-                <w:lang w:val="en-US"/>
-              </w:rPr>
-              <w:t>{{ translations.</w:t>
-            </w:r>
-            <w:r>
-              <w:rPr>
-                <w:sz w:val="20"/>
-                <w:szCs w:val="20"/>
-                <w:lang w:val="en-US"/>
-              </w:rPr>
-              <w:t xml:space="preserve"> </w:t>
+              <w:t xml:space="preserve">  %</w:t>
+            </w:r>
+            <w:proofErr w:type="gramEnd"/>
+            <w:r>
+              <w:rPr>
+                <w:b/>
+                <w:bCs/>
+                <w:sz w:val="20"/>
+                <w:szCs w:val="20"/>
+                <w:lang w:val="en-US"/>
+              </w:rPr>
+              <w:t xml:space="preserve">}{{ translations. </w:t>
             </w:r>
             <w:proofErr w:type="spellStart"/>
             <w:r>
@@ -305,8 +424,6 @@
       </w:tr>
       <w:tr>
         <w:trPr>
-          <w:gridAfter w:val="1"/>
-          <w:wAfter w:w="13" w:type="dxa"/>
           <w:trHeight w:val="340"/>
         </w:trPr>
         <w:tc>
@@ -314,8 +431,7 @@
             <w:tcW w:w="688" w:type="dxa"/>
             <w:vMerge/>
             <w:tcBorders>
-              <w:top w:val="single" w:sz="12" w:space="0" w:color="666666"/>
-              <w:left w:val="nil"/>
+              <w:left w:val="single" w:sz="12" w:space="0" w:color="FFFFFF" w:themeColor="background1"/>
               <w:bottom w:val="single" w:sz="12" w:space="0" w:color="auto"/>
             </w:tcBorders>
             <w:vAlign w:val="center"/>
@@ -323,6 +439,7 @@
           <w:p>
             <w:pPr>
               <w:spacing w:before="0" w:after="0" w:line="240" w:lineRule="auto"/>
+              <w:jc w:val="left"/>
               <w:rPr>
                 <w:b/>
                 <w:bCs/>
@@ -345,7 +462,10 @@
           <w:p>
             <w:pPr>
               <w:spacing w:before="0" w:after="0" w:line="240" w:lineRule="auto"/>
-              <w:rPr>
+              <w:jc w:val="left"/>
+              <w:rPr>
+                <w:b/>
+                <w:bCs/>
                 <w:sz w:val="20"/>
                 <w:szCs w:val="20"/>
                 <w:lang w:val="en-US"/>
@@ -365,7 +485,10 @@
           <w:p>
             <w:pPr>
               <w:spacing w:before="0" w:after="0" w:line="240" w:lineRule="auto"/>
-              <w:rPr>
+              <w:jc w:val="left"/>
+              <w:rPr>
+                <w:b/>
+                <w:bCs/>
                 <w:sz w:val="20"/>
                 <w:szCs w:val="20"/>
                 <w:lang w:val="en-US"/>
@@ -385,7 +508,10 @@
           <w:p>
             <w:pPr>
               <w:spacing w:before="0" w:after="0" w:line="240" w:lineRule="auto"/>
-              <w:rPr>
+              <w:jc w:val="left"/>
+              <w:rPr>
+                <w:b/>
+                <w:bCs/>
                 <w:sz w:val="20"/>
                 <w:szCs w:val="20"/>
                 <w:lang w:val="en-US"/>
@@ -399,6 +525,7 @@
             <w:tcBorders>
               <w:bottom w:val="single" w:sz="12" w:space="0" w:color="auto"/>
             </w:tcBorders>
+            <w:vAlign w:val="center"/>
           </w:tcPr>
           <w:p>
             <w:pPr>
@@ -450,7 +577,7 @@
           <w:tcPr>
             <w:tcW w:w="968" w:type="dxa"/>
             <w:tcBorders>
-              <w:top w:val="single" w:sz="2" w:space="0" w:color="7F7F7F"/>
+              <w:top w:val="single" w:sz="4" w:space="0" w:color="A6A6A6" w:themeColor="background1" w:themeShade="A6"/>
               <w:bottom w:val="single" w:sz="12" w:space="0" w:color="auto"/>
             </w:tcBorders>
             <w:vAlign w:val="center"/>
@@ -464,26 +591,39 @@
                 <w:bCs/>
                 <w:sz w:val="20"/>
                 <w:szCs w:val="20"/>
-              </w:rPr>
-            </w:pPr>
-            <w:r>
-              <w:rPr>
-                <w:b/>
-                <w:bCs/>
-                <w:sz w:val="20"/>
-                <w:szCs w:val="20"/>
-              </w:rPr>
-              <w:t>{{ year }}</w:t>
-            </w:r>
-          </w:p>
-        </w:tc>
-        <w:tc>
-          <w:tcPr>
-            <w:tcW w:w="968" w:type="dxa"/>
-            <w:tcBorders>
-              <w:top w:val="single" w:sz="2" w:space="0" w:color="7F7F7F"/>
-              <w:bottom w:val="single" w:sz="12" w:space="0" w:color="auto"/>
-              <w:right w:val="nil"/>
+                <w:lang w:val="en-US"/>
+              </w:rPr>
+            </w:pPr>
+            <w:proofErr w:type="gramStart"/>
+            <w:r>
+              <w:rPr>
+                <w:b/>
+                <w:bCs/>
+                <w:sz w:val="20"/>
+                <w:szCs w:val="20"/>
+                <w:lang w:val="en-US"/>
+              </w:rPr>
+              <w:t>{{ year</w:t>
+            </w:r>
+            <w:proofErr w:type="gramEnd"/>
+            <w:r>
+              <w:rPr>
+                <w:b/>
+                <w:bCs/>
+                <w:sz w:val="20"/>
+                <w:szCs w:val="20"/>
+                <w:lang w:val="en-US"/>
+              </w:rPr>
+              <w:t xml:space="preserve"> }}</w:t>
+            </w:r>
+          </w:p>
+        </w:tc>
+        <w:tc>
+          <w:tcPr>
+            <w:tcW w:w="981" w:type="dxa"/>
+            <w:tcBorders>
+              <w:bottom w:val="single" w:sz="4" w:space="0" w:color="A6A6A6" w:themeColor="background1" w:themeShade="A6"/>
+              <w:right w:val="single" w:sz="12" w:space="0" w:color="FFFFFF" w:themeColor="background1"/>
             </w:tcBorders>
             <w:vAlign w:val="center"/>
           </w:tcPr>
@@ -506,18 +646,58 @@
                 <w:szCs w:val="20"/>
               </w:rPr>
               <w:t>{%tc endfor %}}</w:t>
+            </w:r>
+          </w:p>
+        </w:tc>
+      </w:tr>
+      <w:bookmarkEnd w:id="0"/>
+      <w:tr>
+        <w:trPr>
+          <w:trHeight w:val="340"/>
+        </w:trPr>
+        <w:tc>
+          <w:tcPr>
+            <w:tcW w:w="9320" w:type="dxa"/>
+            <w:gridSpan w:val="7"/>
+            <w:tcBorders>
+              <w:top w:val="single" w:sz="12" w:space="0" w:color="auto"/>
+              <w:left w:val="single" w:sz="12" w:space="0" w:color="FFFFFF" w:themeColor="background1"/>
+              <w:bottom w:val="single" w:sz="4" w:space="0" w:color="A6A6A6" w:themeColor="background1" w:themeShade="A6"/>
+              <w:right w:val="single" w:sz="12" w:space="0" w:color="FFFFFF" w:themeColor="background1"/>
+            </w:tcBorders>
+            <w:vAlign w:val="center"/>
+          </w:tcPr>
+          <w:p>
+            <w:pPr>
+              <w:spacing w:before="0" w:after="0" w:line="240" w:lineRule="auto"/>
+              <w:jc w:val="left"/>
+              <w:rPr>
+                <w:sz w:val="20"/>
+                <w:szCs w:val="20"/>
+                <w:lang w:val="en-US"/>
+              </w:rPr>
+            </w:pPr>
+            <w:r>
+              <w:rPr>
+                <w:sz w:val="20"/>
+                <w:szCs w:val="20"/>
+                <w:lang w:val="en-US"/>
+              </w:rPr>
+              <w:t>{%tr for row in table %}</w:t>
             </w:r>
           </w:p>
         </w:tc>
       </w:tr>
       <w:tr>
-        <w:tc>
-          <w:tcPr>
-            <w:tcW w:w="9307" w:type="dxa"/>
-            <w:gridSpan w:val="8"/>
-            <w:tcBorders>
-              <w:top w:val="single" w:sz="12" w:space="0" w:color="auto"/>
-              <w:left w:val="nil"/>
+        <w:trPr>
+          <w:trHeight w:val="340"/>
+        </w:trPr>
+        <w:tc>
+          <w:tcPr>
+            <w:tcW w:w="688" w:type="dxa"/>
+            <w:tcBorders>
+              <w:top w:val="single" w:sz="4" w:space="0" w:color="A6A6A6" w:themeColor="background1" w:themeShade="A6"/>
+              <w:left w:val="single" w:sz="12" w:space="0" w:color="FFFFFF" w:themeColor="background1"/>
               <w:bottom w:val="single" w:sz="4" w:space="0" w:color="A6A6A6" w:themeColor="background1" w:themeShade="A6"/>
             </w:tcBorders>
             <w:vAlign w:val="center"/>
@@ -527,363 +707,367 @@
               <w:spacing w:before="0" w:after="0" w:line="240" w:lineRule="auto"/>
               <w:jc w:val="left"/>
               <w:rPr>
-                <w:sz w:val="20"/>
-                <w:szCs w:val="20"/>
-                <w:lang w:val="en-US"/>
-              </w:rPr>
-            </w:pPr>
-            <w:r>
-              <w:rPr>
-                <w:sz w:val="20"/>
-                <w:szCs w:val="20"/>
-                <w:lang w:val="en-US"/>
-              </w:rPr>
-              <w:t>{%tr for row in table %}</w:t>
+                <w:b/>
+                <w:bCs/>
+                <w:sz w:val="20"/>
+                <w:szCs w:val="20"/>
+                <w:lang w:val="en-US"/>
+              </w:rPr>
+            </w:pPr>
+            <w:proofErr w:type="gramStart"/>
+            <w:r>
+              <w:rPr>
+                <w:b/>
+                <w:bCs/>
+                <w:sz w:val="20"/>
+                <w:szCs w:val="20"/>
+                <w:lang w:val="en-US"/>
+              </w:rPr>
+              <w:t>R{</w:t>
+            </w:r>
+            <w:proofErr w:type="gramEnd"/>
+            <w:r>
+              <w:rPr>
+                <w:b/>
+                <w:bCs/>
+                <w:sz w:val="20"/>
+                <w:szCs w:val="20"/>
+                <w:lang w:val="en-US"/>
+              </w:rPr>
+              <w:t>{ row.id }}</w:t>
+            </w:r>
+          </w:p>
+        </w:tc>
+        <w:tc>
+          <w:tcPr>
+            <w:tcW w:w="2339" w:type="dxa"/>
+            <w:tcBorders>
+              <w:top w:val="single" w:sz="4" w:space="0" w:color="A6A6A6" w:themeColor="background1" w:themeShade="A6"/>
+              <w:bottom w:val="single" w:sz="4" w:space="0" w:color="A6A6A6" w:themeColor="background1" w:themeShade="A6"/>
+            </w:tcBorders>
+            <w:vAlign w:val="center"/>
+          </w:tcPr>
+          <w:p>
+            <w:pPr>
+              <w:spacing w:before="0" w:after="0" w:line="240" w:lineRule="auto"/>
+              <w:jc w:val="left"/>
+              <w:rPr>
+                <w:sz w:val="20"/>
+                <w:szCs w:val="20"/>
+                <w:lang w:val="en-US"/>
+              </w:rPr>
+            </w:pPr>
+            <w:proofErr w:type="gramStart"/>
+            <w:r>
+              <w:rPr>
+                <w:sz w:val="20"/>
+                <w:szCs w:val="20"/>
+                <w:lang w:val="en-US"/>
+              </w:rPr>
+              <w:t xml:space="preserve">{{ </w:t>
+            </w:r>
+            <w:proofErr w:type="spellStart"/>
+            <w:r>
+              <w:rPr>
+                <w:sz w:val="20"/>
+                <w:szCs w:val="20"/>
+                <w:lang w:val="en-US"/>
+              </w:rPr>
+              <w:t>row</w:t>
+            </w:r>
+            <w:proofErr w:type="gramEnd"/>
+            <w:r>
+              <w:rPr>
+                <w:sz w:val="20"/>
+                <w:szCs w:val="20"/>
+                <w:lang w:val="en-US"/>
+              </w:rPr>
+              <w:t>.service</w:t>
+            </w:r>
+            <w:proofErr w:type="spellEnd"/>
+            <w:r>
+              <w:rPr>
+                <w:sz w:val="20"/>
+                <w:szCs w:val="20"/>
+                <w:lang w:val="en-US"/>
+              </w:rPr>
+              <w:t xml:space="preserve"> }} &gt; {{ </w:t>
+            </w:r>
+            <w:proofErr w:type="spellStart"/>
+            <w:r>
+              <w:rPr>
+                <w:sz w:val="20"/>
+                <w:szCs w:val="20"/>
+                <w:lang w:val="en-US"/>
+              </w:rPr>
+              <w:t>row.asset</w:t>
+            </w:r>
+            <w:proofErr w:type="spellEnd"/>
+            <w:r>
+              <w:rPr>
+                <w:sz w:val="20"/>
+                <w:szCs w:val="20"/>
+                <w:lang w:val="en-US"/>
+              </w:rPr>
+              <w:t xml:space="preserve"> }}</w:t>
+            </w:r>
+          </w:p>
+        </w:tc>
+        <w:tc>
+          <w:tcPr>
+            <w:tcW w:w="1653" w:type="dxa"/>
+            <w:tcBorders>
+              <w:top w:val="single" w:sz="4" w:space="0" w:color="A6A6A6" w:themeColor="background1" w:themeShade="A6"/>
+              <w:bottom w:val="single" w:sz="4" w:space="0" w:color="A6A6A6" w:themeColor="background1" w:themeShade="A6"/>
+            </w:tcBorders>
+            <w:vAlign w:val="center"/>
+          </w:tcPr>
+          <w:p>
+            <w:pPr>
+              <w:spacing w:before="0" w:after="0" w:line="240" w:lineRule="auto"/>
+              <w:jc w:val="left"/>
+              <w:rPr>
+                <w:sz w:val="20"/>
+                <w:szCs w:val="20"/>
+                <w:lang w:val="en-US"/>
+              </w:rPr>
+            </w:pPr>
+            <w:proofErr w:type="gramStart"/>
+            <w:r>
+              <w:rPr>
+                <w:sz w:val="20"/>
+                <w:szCs w:val="20"/>
+                <w:lang w:val="en-US"/>
+              </w:rPr>
+              <w:t xml:space="preserve">{{ </w:t>
+            </w:r>
+            <w:proofErr w:type="spellStart"/>
+            <w:r>
+              <w:rPr>
+                <w:sz w:val="20"/>
+                <w:szCs w:val="20"/>
+                <w:lang w:val="en-US"/>
+              </w:rPr>
+              <w:t>row</w:t>
+            </w:r>
+            <w:proofErr w:type="gramEnd"/>
+            <w:r>
+              <w:rPr>
+                <w:sz w:val="20"/>
+                <w:szCs w:val="20"/>
+                <w:lang w:val="en-US"/>
+              </w:rPr>
+              <w:t>.threat</w:t>
+            </w:r>
+            <w:proofErr w:type="spellEnd"/>
+            <w:r>
+              <w:rPr>
+                <w:sz w:val="20"/>
+                <w:szCs w:val="20"/>
+                <w:lang w:val="en-US"/>
+              </w:rPr>
+              <w:t xml:space="preserve"> }}</w:t>
+            </w:r>
+          </w:p>
+        </w:tc>
+        <w:tc>
+          <w:tcPr>
+            <w:tcW w:w="1274" w:type="dxa"/>
+            <w:tcBorders>
+              <w:top w:val="single" w:sz="4" w:space="0" w:color="A6A6A6" w:themeColor="background1" w:themeShade="A6"/>
+              <w:bottom w:val="single" w:sz="4" w:space="0" w:color="A6A6A6" w:themeColor="background1" w:themeShade="A6"/>
+            </w:tcBorders>
+            <w:vAlign w:val="center"/>
+          </w:tcPr>
+          <w:p>
+            <w:pPr>
+              <w:spacing w:before="0" w:after="0" w:line="240" w:lineRule="auto"/>
+              <w:jc w:val="left"/>
+              <w:rPr>
+                <w:sz w:val="20"/>
+                <w:szCs w:val="20"/>
+                <w:lang w:val="en-US"/>
+              </w:rPr>
+            </w:pPr>
+            <w:proofErr w:type="gramStart"/>
+            <w:r>
+              <w:rPr>
+                <w:sz w:val="20"/>
+                <w:szCs w:val="20"/>
+                <w:lang w:val="en-US"/>
+              </w:rPr>
+              <w:t>{{ row</w:t>
+            </w:r>
+            <w:proofErr w:type="gramEnd"/>
+            <w:r>
+              <w:rPr>
+                <w:sz w:val="20"/>
+                <w:szCs w:val="20"/>
+                <w:lang w:val="en-US"/>
+              </w:rPr>
+              <w:t>.</w:t>
+            </w:r>
+            <w:r>
+              <w:rPr>
+                <w:sz w:val="20"/>
+                <w:szCs w:val="20"/>
+              </w:rPr>
+              <w:t xml:space="preserve"> </w:t>
+            </w:r>
+            <w:r>
+              <w:rPr>
+                <w:sz w:val="20"/>
+                <w:szCs w:val="20"/>
+                <w:lang w:val="en-US"/>
+              </w:rPr>
+              <w:t>vulnerability }}</w:t>
+            </w:r>
+          </w:p>
+        </w:tc>
+        <w:tc>
+          <w:tcPr>
+            <w:tcW w:w="1417" w:type="dxa"/>
+            <w:tcBorders>
+              <w:top w:val="single" w:sz="4" w:space="0" w:color="A6A6A6" w:themeColor="background1" w:themeShade="A6"/>
+              <w:bottom w:val="single" w:sz="4" w:space="0" w:color="A6A6A6" w:themeColor="background1" w:themeShade="A6"/>
+            </w:tcBorders>
+          </w:tcPr>
+          <w:p>
+            <w:pPr>
+              <w:spacing w:before="0" w:after="0" w:line="240" w:lineRule="auto"/>
+              <w:jc w:val="right"/>
+              <w:rPr>
+                <w:sz w:val="20"/>
+                <w:szCs w:val="20"/>
+                <w:lang w:val="en-US"/>
+              </w:rPr>
+            </w:pPr>
+            <w:r>
+              <w:rPr>
+                <w:sz w:val="20"/>
+                <w:szCs w:val="20"/>
+                <w:lang w:val="en-US"/>
+              </w:rPr>
+              <w:t>{%</w:t>
+            </w:r>
+            <w:proofErr w:type="spellStart"/>
+            <w:r>
+              <w:rPr>
+                <w:sz w:val="20"/>
+                <w:szCs w:val="20"/>
+                <w:lang w:val="en-US"/>
+              </w:rPr>
+              <w:t>tc</w:t>
+            </w:r>
+            <w:proofErr w:type="spellEnd"/>
+            <w:r>
+              <w:rPr>
+                <w:sz w:val="20"/>
+                <w:szCs w:val="20"/>
+                <w:lang w:val="en-US"/>
+              </w:rPr>
+              <w:t xml:space="preserve"> for year in years %}</w:t>
+            </w:r>
+          </w:p>
+        </w:tc>
+        <w:tc>
+          <w:tcPr>
+            <w:tcW w:w="968" w:type="dxa"/>
+            <w:tcBorders>
+              <w:top w:val="single" w:sz="4" w:space="0" w:color="A6A6A6" w:themeColor="background1" w:themeShade="A6"/>
+              <w:bottom w:val="single" w:sz="4" w:space="0" w:color="A6A6A6" w:themeColor="background1" w:themeShade="A6"/>
+            </w:tcBorders>
+            <w:vAlign w:val="center"/>
+          </w:tcPr>
+          <w:p>
+            <w:pPr>
+              <w:spacing w:before="0" w:after="0" w:line="240" w:lineRule="auto"/>
+              <w:jc w:val="right"/>
+              <w:rPr>
+                <w:sz w:val="20"/>
+                <w:szCs w:val="20"/>
+                <w:lang w:val="en-US"/>
+              </w:rPr>
+            </w:pPr>
+            <w:proofErr w:type="gramStart"/>
+            <w:r>
+              <w:rPr>
+                <w:sz w:val="20"/>
+                <w:szCs w:val="20"/>
+                <w:lang w:val="en-US"/>
+              </w:rPr>
+              <w:t xml:space="preserve">{{ </w:t>
+            </w:r>
+            <w:proofErr w:type="spellStart"/>
+            <w:r>
+              <w:rPr>
+                <w:sz w:val="20"/>
+                <w:szCs w:val="20"/>
+                <w:lang w:val="en-US"/>
+              </w:rPr>
+              <w:t>row</w:t>
+            </w:r>
+            <w:proofErr w:type="gramEnd"/>
+            <w:r>
+              <w:rPr>
+                <w:sz w:val="20"/>
+                <w:szCs w:val="20"/>
+                <w:lang w:val="en-US"/>
+              </w:rPr>
+              <w:t>.risks_values</w:t>
+            </w:r>
+            <w:proofErr w:type="spellEnd"/>
+            <w:r>
+              <w:rPr>
+                <w:sz w:val="20"/>
+                <w:szCs w:val="20"/>
+                <w:lang w:val="en-US"/>
+              </w:rPr>
+              <w:t xml:space="preserve">[year]['max']  }} </w:t>
+            </w:r>
+          </w:p>
+        </w:tc>
+        <w:tc>
+          <w:tcPr>
+            <w:tcW w:w="981" w:type="dxa"/>
+            <w:tcBorders>
+              <w:top w:val="single" w:sz="4" w:space="0" w:color="A6A6A6" w:themeColor="background1" w:themeShade="A6"/>
+              <w:bottom w:val="single" w:sz="4" w:space="0" w:color="A6A6A6" w:themeColor="background1" w:themeShade="A6"/>
+              <w:right w:val="single" w:sz="12" w:space="0" w:color="FFFFFF" w:themeColor="background1"/>
+            </w:tcBorders>
+            <w:vAlign w:val="center"/>
+          </w:tcPr>
+          <w:p>
+            <w:pPr>
+              <w:spacing w:before="0" w:after="0" w:line="240" w:lineRule="auto"/>
+              <w:jc w:val="right"/>
+              <w:rPr>
+                <w:sz w:val="20"/>
+                <w:szCs w:val="20"/>
+              </w:rPr>
+            </w:pPr>
+            <w:r>
+              <w:rPr>
+                <w:sz w:val="20"/>
+                <w:szCs w:val="20"/>
+              </w:rPr>
+              <w:t>{%tc endfor %}}</w:t>
             </w:r>
           </w:p>
         </w:tc>
       </w:tr>
       <w:tr>
-        <w:tc>
-          <w:tcPr>
-            <w:tcW w:w="688" w:type="dxa"/>
+        <w:trPr>
+          <w:trHeight w:val="340"/>
+        </w:trPr>
+        <w:tc>
+          <w:tcPr>
+            <w:tcW w:w="9320" w:type="dxa"/>
+            <w:gridSpan w:val="7"/>
             <w:tcBorders>
               <w:top w:val="single" w:sz="4" w:space="0" w:color="A6A6A6" w:themeColor="background1" w:themeShade="A6"/>
-              <w:left w:val="nil"/>
-              <w:bottom w:val="single" w:sz="4" w:space="0" w:color="A6A6A6" w:themeColor="background1" w:themeShade="A6"/>
-            </w:tcBorders>
-            <w:vAlign w:val="center"/>
-          </w:tcPr>
-          <w:p>
-            <w:pPr>
-              <w:spacing w:before="0" w:after="0" w:line="240" w:lineRule="auto"/>
-              <w:jc w:val="left"/>
-              <w:rPr>
-                <w:b/>
-                <w:bCs/>
-                <w:sz w:val="20"/>
-                <w:szCs w:val="20"/>
-                <w:lang w:val="en-US"/>
-              </w:rPr>
-            </w:pPr>
-            <w:r>
-              <w:rPr>
-                <w:b/>
-                <w:bCs/>
-                <w:sz w:val="20"/>
-                <w:szCs w:val="20"/>
-                <w:lang w:val="en-US"/>
-              </w:rPr>
-              <w:t>R</w:t>
-            </w:r>
-            <w:r>
-              <w:rPr>
-                <w:b/>
-                <w:bCs/>
-                <w:sz w:val="20"/>
-                <w:szCs w:val="20"/>
-                <w:lang w:val="en-US"/>
-              </w:rPr>
-              <w:t>{{ row.id }}</w:t>
-            </w:r>
-          </w:p>
-        </w:tc>
-        <w:tc>
-          <w:tcPr>
-            <w:tcW w:w="2339" w:type="dxa"/>
-            <w:tcBorders>
-              <w:top w:val="single" w:sz="4" w:space="0" w:color="A6A6A6" w:themeColor="background1" w:themeShade="A6"/>
-              <w:bottom w:val="single" w:sz="4" w:space="0" w:color="A6A6A6" w:themeColor="background1" w:themeShade="A6"/>
-            </w:tcBorders>
-            <w:vAlign w:val="center"/>
-          </w:tcPr>
-          <w:p>
-            <w:pPr>
-              <w:spacing w:before="0" w:after="0" w:line="240" w:lineRule="auto"/>
-              <w:jc w:val="left"/>
-              <w:rPr>
-                <w:sz w:val="20"/>
-                <w:szCs w:val="20"/>
-                <w:lang w:val="en-US"/>
-              </w:rPr>
-            </w:pPr>
-            <w:r>
-              <w:rPr>
-                <w:sz w:val="20"/>
-                <w:szCs w:val="20"/>
-                <w:lang w:val="en-US"/>
-              </w:rPr>
-              <w:t xml:space="preserve">{{ </w:t>
-            </w:r>
-            <w:proofErr w:type="spellStart"/>
-            <w:r>
-              <w:rPr>
-                <w:sz w:val="20"/>
-                <w:szCs w:val="20"/>
-                <w:lang w:val="en-US"/>
-              </w:rPr>
-              <w:t>row.service</w:t>
-            </w:r>
-            <w:proofErr w:type="spellEnd"/>
-            <w:r>
-              <w:rPr>
-                <w:sz w:val="20"/>
-                <w:szCs w:val="20"/>
-                <w:lang w:val="en-US"/>
-              </w:rPr>
-              <w:t xml:space="preserve"> }} &gt; {{ </w:t>
-            </w:r>
-            <w:proofErr w:type="spellStart"/>
-            <w:r>
-              <w:rPr>
-                <w:sz w:val="20"/>
-                <w:szCs w:val="20"/>
-                <w:lang w:val="en-US"/>
-              </w:rPr>
-              <w:t>row.asset</w:t>
-            </w:r>
-            <w:proofErr w:type="spellEnd"/>
-            <w:r>
-              <w:rPr>
-                <w:sz w:val="20"/>
-                <w:szCs w:val="20"/>
-                <w:lang w:val="en-US"/>
-              </w:rPr>
-              <w:t xml:space="preserve"> }}</w:t>
-            </w:r>
-          </w:p>
-        </w:tc>
-        <w:tc>
-          <w:tcPr>
-            <w:tcW w:w="1653" w:type="dxa"/>
-            <w:tcBorders>
-              <w:top w:val="single" w:sz="4" w:space="0" w:color="A6A6A6" w:themeColor="background1" w:themeShade="A6"/>
-              <w:bottom w:val="single" w:sz="4" w:space="0" w:color="A6A6A6" w:themeColor="background1" w:themeShade="A6"/>
-            </w:tcBorders>
-            <w:vAlign w:val="center"/>
-          </w:tcPr>
-          <w:p>
-            <w:pPr>
-              <w:spacing w:before="0" w:after="0" w:line="240" w:lineRule="auto"/>
-              <w:jc w:val="left"/>
-              <w:rPr>
-                <w:sz w:val="20"/>
-                <w:szCs w:val="20"/>
-                <w:lang w:val="en-US"/>
-              </w:rPr>
-            </w:pPr>
-            <w:r>
-              <w:rPr>
-                <w:sz w:val="20"/>
-                <w:szCs w:val="20"/>
-                <w:lang w:val="en-US"/>
-              </w:rPr>
-              <w:t xml:space="preserve">{{ </w:t>
-            </w:r>
-            <w:proofErr w:type="spellStart"/>
-            <w:r>
-              <w:rPr>
-                <w:sz w:val="20"/>
-                <w:szCs w:val="20"/>
-                <w:lang w:val="en-US"/>
-              </w:rPr>
-              <w:t>row.threat</w:t>
-            </w:r>
-            <w:proofErr w:type="spellEnd"/>
-            <w:r>
-              <w:rPr>
-                <w:sz w:val="20"/>
-                <w:szCs w:val="20"/>
-                <w:lang w:val="en-US"/>
-              </w:rPr>
-              <w:t xml:space="preserve"> }}</w:t>
-            </w:r>
-          </w:p>
-        </w:tc>
-        <w:tc>
-          <w:tcPr>
-            <w:tcW w:w="1274" w:type="dxa"/>
-            <w:tcBorders>
-              <w:top w:val="single" w:sz="4" w:space="0" w:color="A6A6A6" w:themeColor="background1" w:themeShade="A6"/>
-              <w:bottom w:val="single" w:sz="4" w:space="0" w:color="A6A6A6" w:themeColor="background1" w:themeShade="A6"/>
-            </w:tcBorders>
-            <w:vAlign w:val="center"/>
-          </w:tcPr>
-          <w:p>
-            <w:pPr>
-              <w:spacing w:before="0" w:after="0" w:line="240" w:lineRule="auto"/>
-              <w:jc w:val="left"/>
-              <w:rPr>
-                <w:sz w:val="20"/>
-                <w:szCs w:val="20"/>
-                <w:lang w:val="en-US"/>
-              </w:rPr>
-            </w:pPr>
-            <w:r>
-              <w:rPr>
-                <w:sz w:val="20"/>
-                <w:szCs w:val="20"/>
-                <w:lang w:val="en-US"/>
-              </w:rPr>
-              <w:t>{{ row.</w:t>
-            </w:r>
-            <w:r>
-              <w:rPr>
-                <w:sz w:val="20"/>
-                <w:szCs w:val="20"/>
-              </w:rPr>
-              <w:t xml:space="preserve"> </w:t>
-            </w:r>
-            <w:r>
-              <w:rPr>
-                <w:sz w:val="20"/>
-                <w:szCs w:val="20"/>
-                <w:lang w:val="en-US"/>
-              </w:rPr>
-              <w:t>v</w:t>
-            </w:r>
-            <w:r>
-              <w:rPr>
-                <w:sz w:val="20"/>
-                <w:szCs w:val="20"/>
-                <w:lang w:val="en-US"/>
-              </w:rPr>
-              <w:t>ulnerability }}</w:t>
-            </w:r>
-          </w:p>
-        </w:tc>
-        <w:tc>
-          <w:tcPr>
-            <w:tcW w:w="1417" w:type="dxa"/>
-            <w:tcBorders>
-              <w:top w:val="single" w:sz="4" w:space="0" w:color="A6A6A6" w:themeColor="background1" w:themeShade="A6"/>
-              <w:bottom w:val="single" w:sz="4" w:space="0" w:color="A6A6A6" w:themeColor="background1" w:themeShade="A6"/>
-            </w:tcBorders>
-          </w:tcPr>
-          <w:p>
-            <w:pPr>
-              <w:spacing w:before="0" w:after="0" w:line="240" w:lineRule="auto"/>
-              <w:jc w:val="right"/>
-              <w:rPr>
-                <w:sz w:val="20"/>
-                <w:szCs w:val="20"/>
-                <w:lang w:val="en-US"/>
-              </w:rPr>
-            </w:pPr>
-            <w:r>
-              <w:rPr>
-                <w:sz w:val="20"/>
-                <w:szCs w:val="20"/>
-                <w:lang w:val="en-US"/>
-              </w:rPr>
-              <w:t>{%</w:t>
-            </w:r>
-            <w:proofErr w:type="spellStart"/>
-            <w:r>
-              <w:rPr>
-                <w:sz w:val="20"/>
-                <w:szCs w:val="20"/>
-                <w:lang w:val="en-US"/>
-              </w:rPr>
-              <w:t>tc</w:t>
-            </w:r>
-            <w:proofErr w:type="spellEnd"/>
-            <w:r>
-              <w:rPr>
-                <w:sz w:val="20"/>
-                <w:szCs w:val="20"/>
-                <w:lang w:val="en-US"/>
-              </w:rPr>
-              <w:t xml:space="preserve"> for year in years %}</w:t>
-            </w:r>
-          </w:p>
-        </w:tc>
-        <w:tc>
-          <w:tcPr>
-            <w:tcW w:w="968" w:type="dxa"/>
-            <w:tcBorders>
-              <w:top w:val="single" w:sz="4" w:space="0" w:color="A6A6A6" w:themeColor="background1" w:themeShade="A6"/>
-              <w:bottom w:val="single" w:sz="4" w:space="0" w:color="A6A6A6" w:themeColor="background1" w:themeShade="A6"/>
-            </w:tcBorders>
-            <w:vAlign w:val="center"/>
-          </w:tcPr>
-          <w:p>
-            <w:pPr>
-              <w:spacing w:before="0" w:after="0" w:line="240" w:lineRule="auto"/>
-              <w:jc w:val="right"/>
-              <w:rPr>
-                <w:sz w:val="20"/>
-                <w:szCs w:val="20"/>
-                <w:lang w:val="en-US"/>
-              </w:rPr>
-            </w:pPr>
-            <w:r>
-              <w:rPr>
-                <w:sz w:val="20"/>
-                <w:szCs w:val="20"/>
-                <w:lang w:val="en-US"/>
-              </w:rPr>
-              <w:t xml:space="preserve">{{ </w:t>
-            </w:r>
-            <w:proofErr w:type="spellStart"/>
-            <w:r>
-              <w:rPr>
-                <w:sz w:val="20"/>
-                <w:szCs w:val="20"/>
-                <w:lang w:val="en-US"/>
-              </w:rPr>
-              <w:t>row.risks_values</w:t>
-            </w:r>
-            <w:proofErr w:type="spellEnd"/>
-            <w:r>
-              <w:rPr>
-                <w:sz w:val="20"/>
-                <w:szCs w:val="20"/>
-                <w:lang w:val="en-US"/>
-              </w:rPr>
-              <w:t xml:space="preserve">[year]['max']  }} </w:t>
-            </w:r>
-          </w:p>
-        </w:tc>
-        <w:tc>
-          <w:tcPr>
-            <w:tcW w:w="968" w:type="dxa"/>
-            <w:gridSpan w:val="2"/>
-            <w:tcBorders>
-              <w:top w:val="single" w:sz="4" w:space="0" w:color="A6A6A6" w:themeColor="background1" w:themeShade="A6"/>
-              <w:bottom w:val="single" w:sz="4" w:space="0" w:color="A6A6A6" w:themeColor="background1" w:themeShade="A6"/>
-              <w:right w:val="nil"/>
-            </w:tcBorders>
-            <w:vAlign w:val="center"/>
-          </w:tcPr>
-          <w:p>
-            <w:pPr>
-              <w:spacing w:before="0" w:after="0" w:line="240" w:lineRule="auto"/>
-              <w:jc w:val="right"/>
-              <w:rPr>
-                <w:sz w:val="20"/>
-                <w:szCs w:val="20"/>
-                <w:lang w:val="en-US"/>
-              </w:rPr>
-            </w:pPr>
-            <w:r>
-              <w:rPr>
-                <w:sz w:val="20"/>
-                <w:szCs w:val="20"/>
-              </w:rPr>
-              <w:t>{%tc endfor %}}</w:t>
-            </w:r>
-          </w:p>
-        </w:tc>
-      </w:tr>
-      <w:tr>
-        <w:tc>
-          <w:tcPr>
-            <w:tcW w:w="9307" w:type="dxa"/>
-            <w:gridSpan w:val="8"/>
-            <w:tcBorders>
-              <w:top w:val="single" w:sz="4" w:space="0" w:color="A6A6A6" w:themeColor="background1" w:themeShade="A6"/>
-              <w:left w:val="nil"/>
+              <w:left w:val="single" w:sz="12" w:space="0" w:color="FFFFFF" w:themeColor="background1"/>
+              <w:right w:val="single" w:sz="12" w:space="0" w:color="FFFFFF" w:themeColor="background1"/>
             </w:tcBorders>
             <w:vAlign w:val="center"/>
           </w:tcPr>
@@ -1341,7 +1525,7 @@
   <w:style w:type="paragraph" w:default="1" w:styleId="Normal">
     <w:name w:val="Normal"/>
     <w:qFormat/>
-    <w:rsid w:val="00214AE7"/>
+    <w:rsid w:val="000D7202"/>
     <w:pPr>
       <w:spacing w:before="240" w:after="240"/>
       <w:jc w:val="both"/>

</xml_diff>

<commit_message>
[reporting][subdocs]Added jinja string filter, comment #639
</commit_message>
<xml_diff>
--- a/reporting/subdocs_templates/table_of_evolution_of_the_highest_risks_template.docx
+++ b/reporting/subdocs_templates/table_of_evolution_of_the_highest_risks_template.docx
@@ -1023,7 +1023,33 @@
                 <w:szCs w:val="20"/>
                 <w:lang w:val="en-US"/>
               </w:rPr>
-              <w:t xml:space="preserve">[year]['max']  }} </w:t>
+              <w:t>[</w:t>
+            </w:r>
+            <w:proofErr w:type="spellStart"/>
+            <w:r>
+              <w:rPr>
+                <w:sz w:val="20"/>
+                <w:szCs w:val="20"/>
+                <w:lang w:val="en-US"/>
+              </w:rPr>
+              <w:t>year</w:t>
+            </w:r>
+            <w:r>
+              <w:rPr>
+                <w:sz w:val="20"/>
+                <w:szCs w:val="20"/>
+                <w:lang w:val="en-US"/>
+              </w:rPr>
+              <w:t>|string</w:t>
+            </w:r>
+            <w:proofErr w:type="spellEnd"/>
+            <w:r>
+              <w:rPr>
+                <w:sz w:val="20"/>
+                <w:szCs w:val="20"/>
+                <w:lang w:val="en-US"/>
+              </w:rPr>
+              <w:t xml:space="preserve">]['max']  }} </w:t>
             </w:r>
           </w:p>
         </w:tc>

</xml_diff>